<commit_message>
Update sample_resume.docx with entirely new dummy content
</commit_message>
<xml_diff>
--- a/data/sample_resume.docx
+++ b/data/sample_resume.docx
@@ -4831,95 +4831,7 @@
         <w:pStyle w:val="Heading2"/>
       </w:pPr>
       <w:r>
-        <w:rPr/>
-        <mc:AlternateContent>
-          <mc:Choice Requires="wps">
-            <w:drawing>
-              <wp:anchor distT="0" distB="0" distL="0" distR="0" allowOverlap="1" layoutInCell="1" locked="0" behindDoc="1" simplePos="0" relativeHeight="487589888">
-                <wp:simplePos x="0" y="0"/>
-                <wp:positionH relativeFrom="page">
-                  <wp:posOffset>457200</wp:posOffset>
-                </wp:positionH>
-                <wp:positionV relativeFrom="paragraph">
-                  <wp:posOffset>246823</wp:posOffset>
-                </wp:positionV>
-                <wp:extent cx="6858000" cy="1270"/>
-                <wp:effectExtent l="0" t="0" r="0" b="0"/>
-                <wp:wrapTopAndBottom/>
-                <wp:docPr id="5" name="Graphic 5"/>
-                <wp:cNvGraphicFramePr>
-                  <a:graphicFrameLocks/>
-                </wp:cNvGraphicFramePr>
-                <a:graphic>
-                  <a:graphicData uri="http://schemas.microsoft.com/office/word/2010/wordprocessingShape">
-                    <wps:wsp>
-                      <wps:cNvPr id="5" name="Graphic 5"/>
-                      <wps:cNvSpPr/>
-                      <wps:spPr>
-                        <a:xfrm>
-                          <a:off x="0" y="0"/>
-                          <a:ext cx="6858000" cy="1270"/>
-                        </a:xfrm>
-                        <a:custGeom>
-                          <a:avLst/>
-                          <a:gdLst/>
-                          <a:ahLst/>
-                          <a:cxnLst/>
-                          <a:rect l="l" t="t" r="r" b="b"/>
-                          <a:pathLst>
-                            <a:path w="6858000" h="0">
-                              <a:moveTo>
-                                <a:pt x="0" y="0"/>
-                              </a:moveTo>
-                              <a:lnTo>
-                                <a:pt x="6858000" y="0"/>
-                              </a:lnTo>
-                            </a:path>
-                          </a:pathLst>
-                        </a:custGeom>
-                        <a:ln w="5054">
-                          <a:solidFill>
-                            <a:srgbClr val="000000"/>
-                          </a:solidFill>
-                          <a:prstDash val="solid"/>
-                        </a:ln>
-                      </wps:spPr>
-                      <wps:bodyPr wrap="square" lIns="0" tIns="0" rIns="0" bIns="0" rtlCol="0">
-                        <a:prstTxWarp prst="textNoShape">
-                          <a:avLst/>
-                        </a:prstTxWarp>
-                        <a:noAutofit/>
-                      </wps:bodyPr>
-                    </wps:wsp>
-                  </a:graphicData>
-                </a:graphic>
-              </wp:anchor>
-            </w:drawing>
-          </mc:Choice>
-          <mc:Fallback>
-            <w:pict>
-              <v:shape style="position:absolute;margin-left:36pt;margin-top:19.434906pt;width:540pt;height:.1pt;mso-position-horizontal-relative:page;mso-position-vertical-relative:paragraph;z-index:-15726592;mso-wrap-distance-left:0;mso-wrap-distance-right:0" id="docshape5" coordorigin="720,389" coordsize="10800,0" path="m720,389l11520,389e" filled="false" stroked="true" strokeweight=".398pt" strokecolor="#000000">
-                <v:path arrowok="t"/>
-                <v:stroke dashstyle="solid"/>
-                <w10:wrap type="topAndBottom"/>
-              </v:shape>
-            </w:pict>
-          </mc:Fallback>
-        </mc:AlternateContent>
-      </w:r>
-      <w:bookmarkStart w:name="Projects" w:id="5"/>
-      <w:bookmarkEnd w:id="5"/>
-      <w:r>
-        <w:rPr>
-          <w:b w:val="0"/>
-        </w:rPr>
-      </w:r>
-      <w:r>
-        <w:rPr>
-          <w:spacing w:val="-2"/>
-          <w:w w:val="115"/>
-        </w:rPr>
-        <w:t>Projects</w:t>
+        <w:t>Academic Academic Projects</w:t>
       </w:r>
     </w:p>
     <w:p>
@@ -5186,245 +5098,7 @@
         </w:rPr>
       </w:pPr>
       <w:r>
-        <w:rPr>
-          <w:w w:val="105"/>
-          <w:sz w:val="20"/>
-        </w:rPr>
-        <w:t>Built</w:t>
-      </w:r>
-      <w:r>
-        <w:rPr>
-          <w:spacing w:val="33"/>
-          <w:w w:val="105"/>
-          <w:sz w:val="20"/>
-        </w:rPr>
-        <w:t> </w:t>
-      </w:r>
-      <w:r>
-        <w:rPr>
-          <w:w w:val="105"/>
-          <w:sz w:val="20"/>
-        </w:rPr>
-        <w:t>a</w:t>
-      </w:r>
-      <w:r>
-        <w:rPr>
-          <w:spacing w:val="33"/>
-          <w:w w:val="105"/>
-          <w:sz w:val="20"/>
-        </w:rPr>
-        <w:t> </w:t>
-      </w:r>
-      <w:r>
-        <w:rPr>
-          <w:w w:val="105"/>
-          <w:sz w:val="20"/>
-        </w:rPr>
-        <w:t>revenue</w:t>
-      </w:r>
-      <w:r>
-        <w:rPr>
-          <w:spacing w:val="33"/>
-          <w:w w:val="105"/>
-          <w:sz w:val="20"/>
-        </w:rPr>
-        <w:t> </w:t>
-      </w:r>
-      <w:r>
-        <w:rPr>
-          <w:w w:val="105"/>
-          <w:sz w:val="20"/>
-        </w:rPr>
-        <w:t>forecasting</w:t>
-      </w:r>
-      <w:r>
-        <w:rPr>
-          <w:spacing w:val="33"/>
-          <w:w w:val="105"/>
-          <w:sz w:val="20"/>
-        </w:rPr>
-        <w:t> </w:t>
-      </w:r>
-      <w:r>
-        <w:rPr>
-          <w:w w:val="105"/>
-          <w:sz w:val="20"/>
-        </w:rPr>
-        <w:t>pipeline</w:t>
-      </w:r>
-      <w:r>
-        <w:rPr>
-          <w:spacing w:val="33"/>
-          <w:w w:val="105"/>
-          <w:sz w:val="20"/>
-        </w:rPr>
-        <w:t> </w:t>
-      </w:r>
-      <w:r>
-        <w:rPr>
-          <w:w w:val="105"/>
-          <w:sz w:val="20"/>
-        </w:rPr>
-        <w:t>on</w:t>
-      </w:r>
-      <w:r>
-        <w:rPr>
-          <w:spacing w:val="33"/>
-          <w:w w:val="105"/>
-          <w:sz w:val="20"/>
-        </w:rPr>
-        <w:t> </w:t>
-      </w:r>
-      <w:r>
-        <w:rPr>
-          <w:w w:val="105"/>
-          <w:sz w:val="20"/>
-        </w:rPr>
-        <w:t>12,800+</w:t>
-      </w:r>
-      <w:r>
-        <w:rPr>
-          <w:spacing w:val="33"/>
-          <w:w w:val="105"/>
-          <w:sz w:val="20"/>
-        </w:rPr>
-        <w:t> </w:t>
-      </w:r>
-      <w:r>
-        <w:rPr>
-          <w:w w:val="105"/>
-          <w:sz w:val="20"/>
-        </w:rPr>
-        <w:t>multifamily</w:t>
-      </w:r>
-      <w:r>
-        <w:rPr>
-          <w:spacing w:val="33"/>
-          <w:w w:val="105"/>
-          <w:sz w:val="20"/>
-        </w:rPr>
-        <w:t> </w:t>
-      </w:r>
-      <w:r>
-        <w:rPr>
-          <w:w w:val="105"/>
-          <w:sz w:val="20"/>
-        </w:rPr>
-        <w:t>property</w:t>
-      </w:r>
-      <w:r>
-        <w:rPr>
-          <w:spacing w:val="33"/>
-          <w:w w:val="105"/>
-          <w:sz w:val="20"/>
-        </w:rPr>
-        <w:t> </w:t>
-      </w:r>
-      <w:r>
-        <w:rPr>
-          <w:w w:val="105"/>
-          <w:sz w:val="20"/>
-        </w:rPr>
-        <w:t>records,</w:t>
-      </w:r>
-      <w:r>
-        <w:rPr>
-          <w:spacing w:val="37"/>
-          <w:w w:val="105"/>
-          <w:sz w:val="20"/>
-        </w:rPr>
-        <w:t> </w:t>
-      </w:r>
-      <w:r>
-        <w:rPr>
-          <w:w w:val="105"/>
-          <w:sz w:val="20"/>
-        </w:rPr>
-        <w:t>achieving</w:t>
-      </w:r>
-      <w:r>
-        <w:rPr>
-          <w:spacing w:val="33"/>
-          <w:w w:val="105"/>
-          <w:sz w:val="20"/>
-        </w:rPr>
-        <w:t> </w:t>
-      </w:r>
-      <w:r>
-        <w:rPr>
-          <w:w w:val="105"/>
-          <w:sz w:val="20"/>
-        </w:rPr>
-        <w:t>70.6%</w:t>
-      </w:r>
-      <w:r>
-        <w:rPr>
-          <w:spacing w:val="33"/>
-          <w:w w:val="105"/>
-          <w:sz w:val="20"/>
-        </w:rPr>
-        <w:t> </w:t>
-      </w:r>
-      <w:r>
-        <w:rPr>
-          <w:w w:val="105"/>
-          <w:sz w:val="20"/>
-        </w:rPr>
-        <w:t>R</w:t>
-      </w:r>
-      <w:r>
-        <w:rPr>
-          <w:rFonts w:ascii="Arial" w:hAnsi="Arial"/>
-          <w:w w:val="105"/>
-          <w:sz w:val="20"/>
-        </w:rPr>
-        <w:t>²</w:t>
-      </w:r>
-      <w:r>
-        <w:rPr>
-          <w:rFonts w:ascii="Arial" w:hAnsi="Arial"/>
-          <w:spacing w:val="27"/>
-          <w:w w:val="105"/>
-          <w:sz w:val="20"/>
-        </w:rPr>
-        <w:t> </w:t>
-      </w:r>
-      <w:r>
-        <w:rPr>
-          <w:w w:val="105"/>
-          <w:sz w:val="20"/>
-        </w:rPr>
-        <w:t>and</w:t>
-      </w:r>
-      <w:r>
-        <w:rPr>
-          <w:spacing w:val="33"/>
-          <w:w w:val="105"/>
-          <w:sz w:val="20"/>
-        </w:rPr>
-        <w:t> </w:t>
-      </w:r>
-      <w:r>
-        <w:rPr>
-          <w:w w:val="105"/>
-          <w:sz w:val="20"/>
-        </w:rPr>
-        <w:t>0.109</w:t>
-      </w:r>
-      <w:r>
-        <w:rPr>
-          <w:spacing w:val="33"/>
-          <w:w w:val="105"/>
-          <w:sz w:val="20"/>
-        </w:rPr>
-        <w:t> </w:t>
-      </w:r>
-      <w:r>
-        <w:rPr>
-          <w:w w:val="105"/>
-          <w:sz w:val="20"/>
-        </w:rPr>
-        <w:t>RMSE, reducing prediction error by 18% over baseline models.</w:t>
+        <w:t>Designed an autonomous agent using Python and SerpAPI to aggregate job postings and dynamically filter candidate pipelines.</w:t>
       </w:r>
     </w:p>
     <w:p>
@@ -5448,311 +5122,7 @@
         </w:rPr>
       </w:pPr>
       <w:r>
-        <w:rPr>
-          <w:w w:val="105"/>
-          <w:sz w:val="20"/>
-        </w:rPr>
-        <w:t>Automated</w:t>
-      </w:r>
-      <w:r>
-        <w:rPr>
-          <w:spacing w:val="36"/>
-          <w:w w:val="105"/>
-          <w:sz w:val="20"/>
-        </w:rPr>
-        <w:t> </w:t>
-      </w:r>
-      <w:r>
-        <w:rPr>
-          <w:w w:val="105"/>
-          <w:sz w:val="20"/>
-        </w:rPr>
-        <w:t>executive</w:t>
-      </w:r>
-      <w:r>
-        <w:rPr>
-          <w:spacing w:val="36"/>
-          <w:w w:val="105"/>
-          <w:sz w:val="20"/>
-        </w:rPr>
-        <w:t> </w:t>
-      </w:r>
-      <w:r>
-        <w:rPr>
-          <w:w w:val="105"/>
-          <w:sz w:val="20"/>
-        </w:rPr>
-        <w:t>reporting</w:t>
-      </w:r>
-      <w:r>
-        <w:rPr>
-          <w:spacing w:val="36"/>
-          <w:w w:val="105"/>
-          <w:sz w:val="20"/>
-        </w:rPr>
-        <w:t> </w:t>
-      </w:r>
-      <w:r>
-        <w:rPr>
-          <w:w w:val="105"/>
-          <w:sz w:val="20"/>
-        </w:rPr>
-        <w:t>using</w:t>
-      </w:r>
-      <w:r>
-        <w:rPr>
-          <w:spacing w:val="36"/>
-          <w:w w:val="105"/>
-          <w:sz w:val="20"/>
-        </w:rPr>
-        <w:t> </w:t>
-      </w:r>
-      <w:r>
-        <w:rPr>
-          <w:w w:val="105"/>
-          <w:sz w:val="20"/>
-        </w:rPr>
-        <w:t>LLM-driven</w:t>
-      </w:r>
-      <w:r>
-        <w:rPr>
-          <w:spacing w:val="36"/>
-          <w:w w:val="105"/>
-          <w:sz w:val="20"/>
-        </w:rPr>
-        <w:t> </w:t>
-      </w:r>
-      <w:r>
-        <w:rPr>
-          <w:w w:val="105"/>
-          <w:sz w:val="20"/>
-        </w:rPr>
-        <w:t>summaries</w:t>
-      </w:r>
-      <w:r>
-        <w:rPr>
-          <w:spacing w:val="36"/>
-          <w:w w:val="105"/>
-          <w:sz w:val="20"/>
-        </w:rPr>
-        <w:t> </w:t>
-      </w:r>
-      <w:r>
-        <w:rPr>
-          <w:w w:val="105"/>
-          <w:sz w:val="20"/>
-        </w:rPr>
-        <w:t>and</w:t>
-      </w:r>
-      <w:r>
-        <w:rPr>
-          <w:spacing w:val="36"/>
-          <w:w w:val="105"/>
-          <w:sz w:val="20"/>
-        </w:rPr>
-        <w:t> </w:t>
-      </w:r>
-      <w:r>
-        <w:rPr>
-          <w:w w:val="105"/>
-          <w:sz w:val="20"/>
-        </w:rPr>
-        <w:t>SHAP-based</w:t>
-      </w:r>
-      <w:r>
-        <w:rPr>
-          <w:spacing w:val="36"/>
-          <w:w w:val="105"/>
-          <w:sz w:val="20"/>
-        </w:rPr>
-        <w:t> </w:t>
-      </w:r>
-      <w:r>
-        <w:rPr>
-          <w:w w:val="105"/>
-          <w:sz w:val="20"/>
-        </w:rPr>
-        <w:t>explainability,</w:t>
-      </w:r>
-      <w:r>
-        <w:rPr>
-          <w:spacing w:val="39"/>
-          <w:w w:val="105"/>
-          <w:sz w:val="20"/>
-        </w:rPr>
-        <w:t> </w:t>
-      </w:r>
-      <w:r>
-        <w:rPr>
-          <w:w w:val="105"/>
-          <w:sz w:val="20"/>
-        </w:rPr>
-        <w:t>delivering</w:t>
-      </w:r>
-      <w:r>
-        <w:rPr>
-          <w:spacing w:val="36"/>
-          <w:w w:val="105"/>
-          <w:sz w:val="20"/>
-        </w:rPr>
-        <w:t> </w:t>
-      </w:r>
-      <w:r>
-        <w:rPr>
-          <w:w w:val="105"/>
-          <w:sz w:val="20"/>
-        </w:rPr>
-        <w:t>interpretable investment</w:t>
-      </w:r>
-      <w:r>
-        <w:rPr>
-          <w:spacing w:val="40"/>
-          <w:w w:val="105"/>
-          <w:sz w:val="20"/>
-        </w:rPr>
-        <w:t> </w:t>
-      </w:r>
-      <w:r>
-        <w:rPr>
-          <w:w w:val="105"/>
-          <w:sz w:val="20"/>
-        </w:rPr>
-        <w:t>insights</w:t>
-      </w:r>
-      <w:r>
-        <w:rPr>
-          <w:spacing w:val="40"/>
-          <w:w w:val="105"/>
-          <w:sz w:val="20"/>
-        </w:rPr>
-        <w:t> </w:t>
-      </w:r>
-      <w:r>
-        <w:rPr>
-          <w:w w:val="105"/>
-          <w:sz w:val="20"/>
-        </w:rPr>
-        <w:t>and</w:t>
-      </w:r>
-      <w:r>
-        <w:rPr>
-          <w:spacing w:val="40"/>
-          <w:w w:val="105"/>
-          <w:sz w:val="20"/>
-        </w:rPr>
-        <w:t> </w:t>
-      </w:r>
-      <w:r>
-        <w:rPr>
-          <w:w w:val="105"/>
-          <w:sz w:val="20"/>
-        </w:rPr>
-        <w:t>validating</w:t>
-      </w:r>
-      <w:r>
-        <w:rPr>
-          <w:spacing w:val="40"/>
-          <w:w w:val="105"/>
-          <w:sz w:val="20"/>
-        </w:rPr>
-        <w:t> </w:t>
-      </w:r>
-      <w:r>
-        <w:rPr>
-          <w:w w:val="105"/>
-          <w:sz w:val="20"/>
-        </w:rPr>
-        <w:t>15-minute</w:t>
-      </w:r>
-      <w:r>
-        <w:rPr>
-          <w:spacing w:val="40"/>
-          <w:w w:val="105"/>
-          <w:sz w:val="20"/>
-        </w:rPr>
-        <w:t> </w:t>
-      </w:r>
-      <w:r>
-        <w:rPr>
-          <w:w w:val="105"/>
-          <w:sz w:val="20"/>
-        </w:rPr>
-        <w:t>city</w:t>
-      </w:r>
-      <w:r>
-        <w:rPr>
-          <w:spacing w:val="40"/>
-          <w:w w:val="105"/>
-          <w:sz w:val="20"/>
-        </w:rPr>
-        <w:t> </w:t>
-      </w:r>
-      <w:r>
-        <w:rPr>
-          <w:w w:val="105"/>
-          <w:sz w:val="20"/>
-        </w:rPr>
-        <w:t>performance</w:t>
-      </w:r>
-      <w:r>
-        <w:rPr>
-          <w:spacing w:val="40"/>
-          <w:w w:val="105"/>
-          <w:sz w:val="20"/>
-        </w:rPr>
-        <w:t> </w:t>
-      </w:r>
-      <w:r>
-        <w:rPr>
-          <w:w w:val="105"/>
-          <w:sz w:val="20"/>
-        </w:rPr>
-        <w:t>patterns</w:t>
-      </w:r>
-      <w:r>
-        <w:rPr>
-          <w:spacing w:val="40"/>
-          <w:w w:val="105"/>
-          <w:sz w:val="20"/>
-        </w:rPr>
-        <w:t> </w:t>
-      </w:r>
-      <w:r>
-        <w:rPr>
-          <w:w w:val="105"/>
-          <w:sz w:val="20"/>
-        </w:rPr>
-        <w:t>via</w:t>
-      </w:r>
-      <w:r>
-        <w:rPr>
-          <w:spacing w:val="40"/>
-          <w:w w:val="105"/>
-          <w:sz w:val="20"/>
-        </w:rPr>
-        <w:t> </w:t>
-      </w:r>
-      <w:r>
-        <w:rPr>
-          <w:w w:val="105"/>
-          <w:sz w:val="20"/>
-        </w:rPr>
-        <w:t>interactive</w:t>
-      </w:r>
-      <w:r>
-        <w:rPr>
-          <w:spacing w:val="40"/>
-          <w:w w:val="105"/>
-          <w:sz w:val="20"/>
-        </w:rPr>
-        <w:t> </w:t>
-      </w:r>
-      <w:r>
-        <w:rPr>
-          <w:w w:val="105"/>
-          <w:sz w:val="20"/>
-        </w:rPr>
-        <w:t>dashboards.</w:t>
+        <w:t>Implemented a custom ranking algorithm matching skills and locations, increasing relevant job discovery by 40% against naive searches.</w:t>
       </w:r>
     </w:p>
     <w:p>
@@ -5766,159 +5136,7 @@
         </w:rPr>
       </w:pPr>
       <w:r>
-        <w:rPr>
-          <w:b/>
-          <w:spacing w:val="-2"/>
-          <w:w w:val="115"/>
-          <w:sz w:val="20"/>
-        </w:rPr>
-        <w:t>Predictive</w:t>
-      </w:r>
-      <w:r>
-        <w:rPr>
-          <w:b/>
-          <w:spacing w:val="1"/>
-          <w:w w:val="115"/>
-          <w:sz w:val="20"/>
-        </w:rPr>
-        <w:t> </w:t>
-      </w:r>
-      <w:r>
-        <w:rPr>
-          <w:b/>
-          <w:spacing w:val="-2"/>
-          <w:w w:val="115"/>
-          <w:sz w:val="20"/>
-        </w:rPr>
-        <w:t>Maintenance</w:t>
-      </w:r>
-      <w:r>
-        <w:rPr>
-          <w:b/>
-          <w:spacing w:val="2"/>
-          <w:w w:val="115"/>
-          <w:sz w:val="20"/>
-        </w:rPr>
-        <w:t> </w:t>
-      </w:r>
-      <w:r>
-        <w:rPr>
-          <w:b/>
-          <w:spacing w:val="-2"/>
-          <w:w w:val="115"/>
-          <w:sz w:val="20"/>
-        </w:rPr>
-        <w:t>Analytics</w:t>
-      </w:r>
-      <w:r>
-        <w:rPr>
-          <w:b/>
-          <w:spacing w:val="1"/>
-          <w:w w:val="115"/>
-          <w:sz w:val="20"/>
-        </w:rPr>
-        <w:t> </w:t>
-      </w:r>
-      <w:r>
-        <w:rPr>
-          <w:b/>
-          <w:spacing w:val="-2"/>
-          <w:w w:val="115"/>
-          <w:sz w:val="20"/>
-        </w:rPr>
-        <w:t>for</w:t>
-      </w:r>
-      <w:r>
-        <w:rPr>
-          <w:b/>
-          <w:spacing w:val="2"/>
-          <w:w w:val="115"/>
-          <w:sz w:val="20"/>
-        </w:rPr>
-        <w:t> </w:t>
-      </w:r>
-      <w:r>
-        <w:rPr>
-          <w:b/>
-          <w:spacing w:val="-2"/>
-          <w:w w:val="115"/>
-          <w:sz w:val="20"/>
-        </w:rPr>
-        <w:t>Oil</w:t>
-      </w:r>
-      <w:r>
-        <w:rPr>
-          <w:b/>
-          <w:spacing w:val="1"/>
-          <w:w w:val="115"/>
-          <w:sz w:val="20"/>
-        </w:rPr>
-        <w:t> </w:t>
-      </w:r>
-      <w:r>
-        <w:rPr>
-          <w:b/>
-          <w:spacing w:val="-2"/>
-          <w:w w:val="115"/>
-          <w:sz w:val="20"/>
-        </w:rPr>
-        <w:t>Wells</w:t>
-      </w:r>
-      <w:r>
-        <w:rPr>
-          <w:b/>
-          <w:spacing w:val="-7"/>
-          <w:w w:val="115"/>
-          <w:sz w:val="20"/>
-        </w:rPr>
-        <w:t> </w:t>
-      </w:r>
-      <w:r>
-        <w:rPr>
-          <w:rFonts w:ascii="Arial"/>
-          <w:i/>
-          <w:spacing w:val="-2"/>
-          <w:w w:val="115"/>
-          <w:sz w:val="20"/>
-        </w:rPr>
-        <w:t>|</w:t>
-      </w:r>
-      <w:r>
-        <w:rPr>
-          <w:rFonts w:ascii="Arial"/>
-          <w:i/>
-          <w:spacing w:val="-12"/>
-          <w:w w:val="115"/>
-          <w:sz w:val="20"/>
-        </w:rPr>
-        <w:t> </w:t>
-      </w:r>
-      <w:r>
-        <w:rPr>
-          <w:i/>
-          <w:spacing w:val="-2"/>
-          <w:w w:val="115"/>
-          <w:sz w:val="20"/>
-        </w:rPr>
-        <w:t>Neural Networks,</w:t>
-      </w:r>
-      <w:r>
-        <w:rPr>
-          <w:i/>
-          <w:spacing w:val="-3"/>
-          <w:w w:val="115"/>
-          <w:sz w:val="20"/>
-        </w:rPr>
-        <w:t> </w:t>
-      </w:r>
-      <w:r>
-        <w:rPr>
-          <w:i/>
-          <w:spacing w:val="-2"/>
-          <w:w w:val="115"/>
-          <w:sz w:val="20"/>
-        </w:rPr>
-        <w:t>PostgreSQL, Docker, Streamlit</w:t>
+        <w:t>Predictive Analytics Dashboard | Machine Learning, Streamlit</w:t>
       </w:r>
     </w:p>
     <w:p>
@@ -5942,267 +5160,7 @@
         </w:rPr>
       </w:pPr>
       <w:r>
-        <w:rPr>
-          <w:w w:val="105"/>
-          <w:sz w:val="20"/>
-        </w:rPr>
-        <w:t>Built</w:t>
-      </w:r>
-      <w:r>
-        <w:rPr>
-          <w:spacing w:val="20"/>
-          <w:w w:val="105"/>
-          <w:sz w:val="20"/>
-        </w:rPr>
-        <w:t> </w:t>
-      </w:r>
-      <w:r>
-        <w:rPr>
-          <w:w w:val="105"/>
-          <w:sz w:val="20"/>
-        </w:rPr>
-        <w:t>data</w:t>
-      </w:r>
-      <w:r>
-        <w:rPr>
-          <w:spacing w:val="21"/>
-          <w:w w:val="105"/>
-          <w:sz w:val="20"/>
-        </w:rPr>
-        <w:t> </w:t>
-      </w:r>
-      <w:r>
-        <w:rPr>
-          <w:w w:val="105"/>
-          <w:sz w:val="20"/>
-        </w:rPr>
-        <w:t>pipeline</w:t>
-      </w:r>
-      <w:r>
-        <w:rPr>
-          <w:spacing w:val="21"/>
-          <w:w w:val="105"/>
-          <w:sz w:val="20"/>
-        </w:rPr>
-        <w:t> </w:t>
-      </w:r>
-      <w:r>
-        <w:rPr>
-          <w:w w:val="105"/>
-          <w:sz w:val="20"/>
-        </w:rPr>
-        <w:t>for</w:t>
-      </w:r>
-      <w:r>
-        <w:rPr>
-          <w:spacing w:val="21"/>
-          <w:w w:val="105"/>
-          <w:sz w:val="20"/>
-        </w:rPr>
-        <w:t> </w:t>
-      </w:r>
-      <w:r>
-        <w:rPr>
-          <w:w w:val="105"/>
-          <w:sz w:val="20"/>
-        </w:rPr>
-        <w:t>drilling</w:t>
-      </w:r>
-      <w:r>
-        <w:rPr>
-          <w:spacing w:val="21"/>
-          <w:w w:val="105"/>
-          <w:sz w:val="20"/>
-        </w:rPr>
-        <w:t> </w:t>
-      </w:r>
-      <w:r>
-        <w:rPr>
-          <w:w w:val="105"/>
-          <w:sz w:val="20"/>
-        </w:rPr>
-        <w:t>sensor</w:t>
-      </w:r>
-      <w:r>
-        <w:rPr>
-          <w:spacing w:val="21"/>
-          <w:w w:val="105"/>
-          <w:sz w:val="20"/>
-        </w:rPr>
-        <w:t> </w:t>
-      </w:r>
-      <w:r>
-        <w:rPr>
-          <w:w w:val="105"/>
-          <w:sz w:val="20"/>
-        </w:rPr>
-        <w:t>data,</w:t>
-      </w:r>
-      <w:r>
-        <w:rPr>
-          <w:spacing w:val="21"/>
-          <w:w w:val="105"/>
-          <w:sz w:val="20"/>
-        </w:rPr>
-        <w:t> </w:t>
-      </w:r>
-      <w:r>
-        <w:rPr>
-          <w:w w:val="105"/>
-          <w:sz w:val="20"/>
-        </w:rPr>
-        <w:t>improving</w:t>
-      </w:r>
-      <w:r>
-        <w:rPr>
-          <w:spacing w:val="20"/>
-          <w:w w:val="105"/>
-          <w:sz w:val="20"/>
-        </w:rPr>
-        <w:t> </w:t>
-      </w:r>
-      <w:r>
-        <w:rPr>
-          <w:w w:val="105"/>
-          <w:sz w:val="20"/>
-        </w:rPr>
-        <w:t>maintenance</w:t>
-      </w:r>
-      <w:r>
-        <w:rPr>
-          <w:spacing w:val="21"/>
-          <w:w w:val="105"/>
-          <w:sz w:val="20"/>
-        </w:rPr>
-        <w:t> </w:t>
-      </w:r>
-      <w:r>
-        <w:rPr>
-          <w:w w:val="105"/>
-          <w:sz w:val="20"/>
-        </w:rPr>
-        <w:t>lead</w:t>
-      </w:r>
-      <w:r>
-        <w:rPr>
-          <w:spacing w:val="21"/>
-          <w:w w:val="105"/>
-          <w:sz w:val="20"/>
-        </w:rPr>
-        <w:t> </w:t>
-      </w:r>
-      <w:r>
-        <w:rPr>
-          <w:w w:val="105"/>
-          <w:sz w:val="20"/>
-        </w:rPr>
-        <w:t>time</w:t>
-      </w:r>
-      <w:r>
-        <w:rPr>
-          <w:spacing w:val="21"/>
-          <w:w w:val="105"/>
-          <w:sz w:val="20"/>
-        </w:rPr>
-        <w:t> </w:t>
-      </w:r>
-      <w:r>
-        <w:rPr>
-          <w:w w:val="105"/>
-          <w:sz w:val="20"/>
-        </w:rPr>
-        <w:t>by</w:t>
-      </w:r>
-      <w:r>
-        <w:rPr>
-          <w:spacing w:val="21"/>
-          <w:w w:val="105"/>
-          <w:sz w:val="20"/>
-        </w:rPr>
-        <w:t> </w:t>
-      </w:r>
-      <w:r>
-        <w:rPr>
-          <w:w w:val="105"/>
-          <w:sz w:val="20"/>
-        </w:rPr>
-        <w:t>7</w:t>
-      </w:r>
-      <w:r>
-        <w:rPr>
-          <w:spacing w:val="21"/>
-          <w:w w:val="105"/>
-          <w:sz w:val="20"/>
-        </w:rPr>
-        <w:t> </w:t>
-      </w:r>
-      <w:r>
-        <w:rPr>
-          <w:w w:val="105"/>
-          <w:sz w:val="20"/>
-        </w:rPr>
-        <w:t>days</w:t>
-      </w:r>
-      <w:r>
-        <w:rPr>
-          <w:spacing w:val="21"/>
-          <w:w w:val="105"/>
-          <w:sz w:val="20"/>
-        </w:rPr>
-        <w:t> </w:t>
-      </w:r>
-      <w:r>
-        <w:rPr>
-          <w:w w:val="105"/>
-          <w:sz w:val="20"/>
-        </w:rPr>
-        <w:t>through</w:t>
-      </w:r>
-      <w:r>
-        <w:rPr>
-          <w:spacing w:val="20"/>
-          <w:w w:val="105"/>
-          <w:sz w:val="20"/>
-        </w:rPr>
-        <w:t> </w:t>
-      </w:r>
-      <w:r>
-        <w:rPr>
-          <w:w w:val="105"/>
-          <w:sz w:val="20"/>
-        </w:rPr>
-        <w:t>early</w:t>
-      </w:r>
-      <w:r>
-        <w:rPr>
-          <w:spacing w:val="21"/>
-          <w:w w:val="105"/>
-          <w:sz w:val="20"/>
-        </w:rPr>
-        <w:t> </w:t>
-      </w:r>
-      <w:r>
-        <w:rPr>
-          <w:w w:val="105"/>
-          <w:sz w:val="20"/>
-        </w:rPr>
-        <w:t>issue</w:t>
-      </w:r>
-      <w:r>
-        <w:rPr>
-          <w:spacing w:val="21"/>
-          <w:w w:val="105"/>
-          <w:sz w:val="20"/>
-        </w:rPr>
-        <w:t> </w:t>
-      </w:r>
-      <w:r>
-        <w:rPr>
-          <w:spacing w:val="-2"/>
-          <w:w w:val="105"/>
-          <w:sz w:val="20"/>
-        </w:rPr>
-        <w:t>detection.</w:t>
+        <w:t>Built end-to-end data pipeline for drilling sensor data, visualizing results in a live Streamlit dashboard.</w:t>
       </w:r>
     </w:p>
     <w:p>
@@ -6226,192 +5184,7 @@
         </w:rPr>
       </w:pPr>
       <w:r>
-        <w:rPr>
-          <w:w w:val="105"/>
-          <w:sz w:val="20"/>
-        </w:rPr>
-        <w:t>Reduced</w:t>
-      </w:r>
-      <w:r>
-        <w:rPr>
-          <w:spacing w:val="15"/>
-          <w:w w:val="105"/>
-          <w:sz w:val="20"/>
-        </w:rPr>
-        <w:t> </w:t>
-      </w:r>
-      <w:r>
-        <w:rPr>
-          <w:w w:val="105"/>
-          <w:sz w:val="20"/>
-        </w:rPr>
-        <w:t>downtime</w:t>
-      </w:r>
-      <w:r>
-        <w:rPr>
-          <w:spacing w:val="15"/>
-          <w:w w:val="105"/>
-          <w:sz w:val="20"/>
-        </w:rPr>
-        <w:t> </w:t>
-      </w:r>
-      <w:r>
-        <w:rPr>
-          <w:w w:val="105"/>
-          <w:sz w:val="20"/>
-        </w:rPr>
-        <w:t>by</w:t>
-      </w:r>
-      <w:r>
-        <w:rPr>
-          <w:spacing w:val="16"/>
-          <w:w w:val="105"/>
-          <w:sz w:val="20"/>
-        </w:rPr>
-        <w:t> </w:t>
-      </w:r>
-      <w:r>
-        <w:rPr>
-          <w:w w:val="105"/>
-          <w:sz w:val="20"/>
-        </w:rPr>
-        <w:t>28%</w:t>
-      </w:r>
-      <w:r>
-        <w:rPr>
-          <w:spacing w:val="15"/>
-          <w:w w:val="105"/>
-          <w:sz w:val="20"/>
-        </w:rPr>
-        <w:t> </w:t>
-      </w:r>
-      <w:r>
-        <w:rPr>
-          <w:w w:val="105"/>
-          <w:sz w:val="20"/>
-        </w:rPr>
-        <w:t>via</w:t>
-      </w:r>
-      <w:r>
-        <w:rPr>
-          <w:spacing w:val="16"/>
-          <w:w w:val="105"/>
-          <w:sz w:val="20"/>
-        </w:rPr>
-        <w:t> </w:t>
-      </w:r>
-      <w:r>
-        <w:rPr>
-          <w:w w:val="105"/>
-          <w:sz w:val="20"/>
-        </w:rPr>
-        <w:t>data-driven</w:t>
-      </w:r>
-      <w:r>
-        <w:rPr>
-          <w:spacing w:val="15"/>
-          <w:w w:val="105"/>
-          <w:sz w:val="20"/>
-        </w:rPr>
-        <w:t> </w:t>
-      </w:r>
-      <w:r>
-        <w:rPr>
-          <w:w w:val="105"/>
-          <w:sz w:val="20"/>
-        </w:rPr>
-        <w:t>maintenance</w:t>
-      </w:r>
-      <w:r>
-        <w:rPr>
-          <w:spacing w:val="15"/>
-          <w:w w:val="105"/>
-          <w:sz w:val="20"/>
-        </w:rPr>
-        <w:t> </w:t>
-      </w:r>
-      <w:r>
-        <w:rPr>
-          <w:w w:val="105"/>
-          <w:sz w:val="20"/>
-        </w:rPr>
-        <w:t>scheduling</w:t>
-      </w:r>
-      <w:r>
-        <w:rPr>
-          <w:spacing w:val="16"/>
-          <w:w w:val="105"/>
-          <w:sz w:val="20"/>
-        </w:rPr>
-        <w:t> </w:t>
-      </w:r>
-      <w:r>
-        <w:rPr>
-          <w:w w:val="105"/>
-          <w:sz w:val="20"/>
-        </w:rPr>
-        <w:t>across</w:t>
-      </w:r>
-      <w:r>
-        <w:rPr>
-          <w:spacing w:val="15"/>
-          <w:w w:val="105"/>
-          <w:sz w:val="20"/>
-        </w:rPr>
-        <w:t> </w:t>
-      </w:r>
-      <w:r>
-        <w:rPr>
-          <w:w w:val="105"/>
-          <w:sz w:val="20"/>
-        </w:rPr>
-        <w:t>5,000+</w:t>
-      </w:r>
-      <w:r>
-        <w:rPr>
-          <w:spacing w:val="16"/>
-          <w:w w:val="105"/>
-          <w:sz w:val="20"/>
-        </w:rPr>
-        <w:t> </w:t>
-      </w:r>
-      <w:r>
-        <w:rPr>
-          <w:w w:val="105"/>
-          <w:sz w:val="20"/>
-        </w:rPr>
-        <w:t>simulated</w:t>
-      </w:r>
-      <w:r>
-        <w:rPr>
-          <w:spacing w:val="15"/>
-          <w:w w:val="105"/>
-          <w:sz w:val="20"/>
-        </w:rPr>
-        <w:t> </w:t>
-      </w:r>
-      <w:r>
-        <w:rPr>
-          <w:w w:val="105"/>
-          <w:sz w:val="20"/>
-        </w:rPr>
-        <w:t>well</w:t>
-      </w:r>
-      <w:r>
-        <w:rPr>
-          <w:spacing w:val="15"/>
-          <w:w w:val="105"/>
-          <w:sz w:val="20"/>
-        </w:rPr>
-        <w:t> </w:t>
-      </w:r>
-      <w:r>
-        <w:rPr>
-          <w:spacing w:val="-2"/>
-          <w:w w:val="105"/>
-          <w:sz w:val="20"/>
-        </w:rPr>
-        <w:t>operations.</w:t>
+        <w:t>Integrated OpenAI LLMs to automatically tailor base resumes to specific job descriptions based on parsed employer constraints.</w:t>
       </w:r>
     </w:p>
     <w:p>
@@ -6424,221 +5197,7 @@
           <w:sz w:val="20"/>
         </w:rPr>
       </w:pPr>
-      <w:r>
-        <w:rPr>
-          <w:b/>
-          <w:w w:val="110"/>
-          <w:sz w:val="20"/>
-        </w:rPr>
-        <w:t>Brain</w:t>
-      </w:r>
-      <w:r>
-        <w:rPr>
-          <w:b/>
-          <w:spacing w:val="18"/>
-          <w:w w:val="110"/>
-          <w:sz w:val="20"/>
-        </w:rPr>
-        <w:t> </w:t>
-      </w:r>
-      <w:r>
-        <w:rPr>
-          <w:b/>
-          <w:w w:val="110"/>
-          <w:sz w:val="20"/>
-        </w:rPr>
-        <w:t>Tumor</w:t>
-      </w:r>
-      <w:r>
-        <w:rPr>
-          <w:b/>
-          <w:spacing w:val="18"/>
-          <w:w w:val="110"/>
-          <w:sz w:val="20"/>
-        </w:rPr>
-        <w:t> </w:t>
-      </w:r>
-      <w:r>
-        <w:rPr>
-          <w:b/>
-          <w:w w:val="110"/>
-          <w:sz w:val="20"/>
-        </w:rPr>
-        <w:t>MRI</w:t>
-      </w:r>
-      <w:r>
-        <w:rPr>
-          <w:b/>
-          <w:spacing w:val="19"/>
-          <w:w w:val="110"/>
-          <w:sz w:val="20"/>
-        </w:rPr>
-        <w:t> </w:t>
-      </w:r>
-      <w:r>
-        <w:rPr>
-          <w:b/>
-          <w:w w:val="110"/>
-          <w:sz w:val="20"/>
-        </w:rPr>
-        <w:t>Classification</w:t>
-      </w:r>
-      <w:r>
-        <w:rPr>
-          <w:b/>
-          <w:spacing w:val="6"/>
-          <w:w w:val="110"/>
-          <w:sz w:val="20"/>
-        </w:rPr>
-        <w:t> </w:t>
-      </w:r>
-      <w:r>
-        <w:rPr>
-          <w:rFonts w:ascii="Arial"/>
-          <w:i/>
-          <w:w w:val="110"/>
-          <w:sz w:val="20"/>
-        </w:rPr>
-        <w:t>|</w:t>
-      </w:r>
-      <w:r>
-        <w:rPr>
-          <w:rFonts w:ascii="Arial"/>
-          <w:i/>
-          <w:spacing w:val="4"/>
-          <w:w w:val="110"/>
-          <w:sz w:val="20"/>
-        </w:rPr>
-        <w:t> </w:t>
-      </w:r>
-      <w:r>
-        <w:rPr>
-          <w:i/>
-          <w:w w:val="110"/>
-          <w:sz w:val="20"/>
-        </w:rPr>
-        <w:t>3D</w:t>
-      </w:r>
-      <w:r>
-        <w:rPr>
-          <w:i/>
-          <w:spacing w:val="13"/>
-          <w:w w:val="110"/>
-          <w:sz w:val="20"/>
-        </w:rPr>
-        <w:t> </w:t>
-      </w:r>
-      <w:r>
-        <w:rPr>
-          <w:i/>
-          <w:w w:val="110"/>
-          <w:sz w:val="20"/>
-        </w:rPr>
-        <w:t>CNNs,</w:t>
-      </w:r>
-      <w:r>
-        <w:rPr>
-          <w:i/>
-          <w:spacing w:val="14"/>
-          <w:w w:val="110"/>
-          <w:sz w:val="20"/>
-        </w:rPr>
-        <w:t> </w:t>
-      </w:r>
-      <w:r>
-        <w:rPr>
-          <w:i/>
-          <w:w w:val="110"/>
-          <w:sz w:val="20"/>
-        </w:rPr>
-        <w:t>PyTorch,</w:t>
-      </w:r>
-      <w:r>
-        <w:rPr>
-          <w:i/>
-          <w:spacing w:val="13"/>
-          <w:w w:val="110"/>
-          <w:sz w:val="20"/>
-        </w:rPr>
-        <w:t> </w:t>
-      </w:r>
-      <w:r>
-        <w:rPr>
-          <w:i/>
-          <w:w w:val="110"/>
-          <w:sz w:val="20"/>
-        </w:rPr>
-        <w:t>Flask</w:t>
-      </w:r>
-      <w:r>
-        <w:rPr>
-          <w:i/>
-          <w:spacing w:val="14"/>
-          <w:w w:val="110"/>
-          <w:sz w:val="20"/>
-        </w:rPr>
-        <w:t> </w:t>
-      </w:r>
-      <w:r>
-        <w:rPr>
-          <w:i/>
-          <w:w w:val="110"/>
-          <w:sz w:val="20"/>
-        </w:rPr>
-        <w:t>APIs,</w:t>
-      </w:r>
-      <w:r>
-        <w:rPr>
-          <w:i/>
-          <w:spacing w:val="13"/>
-          <w:w w:val="110"/>
-          <w:sz w:val="20"/>
-        </w:rPr>
-        <w:t> </w:t>
-      </w:r>
-      <w:r>
-        <w:rPr>
-          <w:i/>
-          <w:w w:val="110"/>
-          <w:sz w:val="20"/>
-        </w:rPr>
-        <w:t>MongoDB</w:t>
-      </w:r>
-      <w:r>
-        <w:rPr>
-          <w:i/>
-          <w:spacing w:val="14"/>
-          <w:w w:val="110"/>
-          <w:sz w:val="20"/>
-        </w:rPr>
-        <w:t> </w:t>
-      </w:r>
-      <w:r>
-        <w:rPr>
-          <w:i/>
-          <w:w w:val="110"/>
-          <w:sz w:val="20"/>
-        </w:rPr>
-        <w:t>Atlas,</w:t>
-      </w:r>
-      <w:r>
-        <w:rPr>
-          <w:i/>
-          <w:spacing w:val="13"/>
-          <w:w w:val="110"/>
-          <w:sz w:val="20"/>
-        </w:rPr>
-        <w:t> </w:t>
-      </w:r>
-      <w:r>
-        <w:rPr>
-          <w:i/>
-          <w:spacing w:val="-2"/>
-          <w:w w:val="110"/>
-          <w:sz w:val="20"/>
-        </w:rPr>
-        <w:t>Docker</w:t>
-      </w:r>
+      <w:r/>
     </w:p>
     <w:p>
       <w:pPr>
@@ -6660,224 +5219,7 @@
           <w:sz w:val="10"/>
         </w:rPr>
       </w:pPr>
-      <w:r>
-        <w:rPr>
-          <w:w w:val="105"/>
-          <w:sz w:val="20"/>
-        </w:rPr>
-        <w:t>Implemented</w:t>
-      </w:r>
-      <w:r>
-        <w:rPr>
-          <w:spacing w:val="13"/>
-          <w:w w:val="105"/>
-          <w:sz w:val="20"/>
-        </w:rPr>
-        <w:t> </w:t>
-      </w:r>
-      <w:r>
-        <w:rPr>
-          <w:w w:val="105"/>
-          <w:sz w:val="20"/>
-        </w:rPr>
-        <w:t>a</w:t>
-      </w:r>
-      <w:r>
-        <w:rPr>
-          <w:spacing w:val="12"/>
-          <w:w w:val="105"/>
-          <w:sz w:val="20"/>
-        </w:rPr>
-        <w:t> </w:t>
-      </w:r>
-      <w:r>
-        <w:rPr>
-          <w:w w:val="105"/>
-          <w:sz w:val="20"/>
-        </w:rPr>
-        <w:t>data</w:t>
-      </w:r>
-      <w:r>
-        <w:rPr>
-          <w:spacing w:val="12"/>
-          <w:w w:val="105"/>
-          <w:sz w:val="20"/>
-        </w:rPr>
-        <w:t> </w:t>
-      </w:r>
-      <w:r>
-        <w:rPr>
-          <w:w w:val="105"/>
-          <w:sz w:val="20"/>
-        </w:rPr>
-        <w:t>pipeline</w:t>
-      </w:r>
-      <w:r>
-        <w:rPr>
-          <w:spacing w:val="14"/>
-          <w:w w:val="105"/>
-          <w:sz w:val="20"/>
-        </w:rPr>
-        <w:t> </w:t>
-      </w:r>
-      <w:r>
-        <w:rPr>
-          <w:w w:val="105"/>
-          <w:sz w:val="20"/>
-        </w:rPr>
-        <w:t>for</w:t>
-      </w:r>
-      <w:r>
-        <w:rPr>
-          <w:spacing w:val="13"/>
-          <w:w w:val="105"/>
-          <w:sz w:val="20"/>
-        </w:rPr>
-        <w:t> </w:t>
-      </w:r>
-      <w:r>
-        <w:rPr>
-          <w:w w:val="105"/>
-          <w:sz w:val="20"/>
-        </w:rPr>
-        <w:t>MRI</w:t>
-      </w:r>
-      <w:r>
-        <w:rPr>
-          <w:spacing w:val="13"/>
-          <w:w w:val="105"/>
-          <w:sz w:val="20"/>
-        </w:rPr>
-        <w:t> </w:t>
-      </w:r>
-      <w:r>
-        <w:rPr>
-          <w:w w:val="105"/>
-          <w:sz w:val="20"/>
-        </w:rPr>
-        <w:t>inference,</w:t>
-      </w:r>
-      <w:r>
-        <w:rPr>
-          <w:spacing w:val="13"/>
-          <w:w w:val="105"/>
-          <w:sz w:val="20"/>
-        </w:rPr>
-        <w:t> </w:t>
-      </w:r>
-      <w:r>
-        <w:rPr>
-          <w:w w:val="105"/>
-          <w:sz w:val="20"/>
-        </w:rPr>
-        <w:t>achieving</w:t>
-      </w:r>
-      <w:r>
-        <w:rPr>
-          <w:spacing w:val="13"/>
-          <w:w w:val="105"/>
-          <w:sz w:val="20"/>
-        </w:rPr>
-        <w:t> </w:t>
-      </w:r>
-      <w:r>
-        <w:rPr>
-          <w:w w:val="105"/>
-          <w:sz w:val="20"/>
-        </w:rPr>
-        <w:t>94%</w:t>
-      </w:r>
-      <w:r>
-        <w:rPr>
-          <w:spacing w:val="13"/>
-          <w:w w:val="105"/>
-          <w:sz w:val="20"/>
-        </w:rPr>
-        <w:t> </w:t>
-      </w:r>
-      <w:r>
-        <w:rPr>
-          <w:w w:val="105"/>
-          <w:sz w:val="20"/>
-        </w:rPr>
-        <w:t>classification</w:t>
-      </w:r>
-      <w:r>
-        <w:rPr>
-          <w:spacing w:val="13"/>
-          <w:w w:val="105"/>
-          <w:sz w:val="20"/>
-        </w:rPr>
-        <w:t> </w:t>
-      </w:r>
-      <w:r>
-        <w:rPr>
-          <w:w w:val="105"/>
-          <w:sz w:val="20"/>
-        </w:rPr>
-        <w:t>accuracy</w:t>
-      </w:r>
-      <w:r>
-        <w:rPr>
-          <w:spacing w:val="14"/>
-          <w:w w:val="105"/>
-          <w:sz w:val="20"/>
-        </w:rPr>
-        <w:t> </w:t>
-      </w:r>
-      <w:r>
-        <w:rPr>
-          <w:w w:val="105"/>
-          <w:sz w:val="20"/>
-        </w:rPr>
-        <w:t>across</w:t>
-      </w:r>
-      <w:r>
-        <w:rPr>
-          <w:spacing w:val="13"/>
-          <w:w w:val="105"/>
-          <w:sz w:val="20"/>
-        </w:rPr>
-        <w:t> </w:t>
-      </w:r>
-      <w:r>
-        <w:rPr>
-          <w:w w:val="105"/>
-          <w:sz w:val="20"/>
-        </w:rPr>
-        <w:t>multiple</w:t>
-      </w:r>
-      <w:r>
-        <w:rPr>
-          <w:spacing w:val="13"/>
-          <w:w w:val="105"/>
-          <w:sz w:val="20"/>
-        </w:rPr>
-        <w:t> </w:t>
-      </w:r>
-      <w:r>
-        <w:rPr>
-          <w:w w:val="105"/>
-          <w:sz w:val="20"/>
-        </w:rPr>
-        <w:t>tumor</w:t>
-      </w:r>
-      <w:r>
-        <w:rPr>
-          <w:spacing w:val="13"/>
-          <w:w w:val="105"/>
-          <w:sz w:val="20"/>
-        </w:rPr>
-        <w:t> </w:t>
-      </w:r>
-      <w:r>
-        <w:rPr>
-          <w:spacing w:val="-2"/>
-          <w:w w:val="105"/>
-          <w:sz w:val="20"/>
-        </w:rPr>
-        <w:t>subtypes.</w:t>
-      </w:r>
+      <w:r/>
     </w:p>
     <w:p>
       <w:pPr>
@@ -6899,239 +5241,7 @@
           <w:sz w:val="10"/>
         </w:rPr>
       </w:pPr>
-      <w:r>
-        <w:rPr>
-          <w:w w:val="105"/>
-          <w:sz w:val="20"/>
-        </w:rPr>
-        <w:t>Logged</w:t>
-      </w:r>
-      <w:r>
-        <w:rPr>
-          <w:spacing w:val="16"/>
-          <w:w w:val="105"/>
-          <w:sz w:val="20"/>
-        </w:rPr>
-        <w:t> </w:t>
-      </w:r>
-      <w:r>
-        <w:rPr>
-          <w:w w:val="105"/>
-          <w:sz w:val="20"/>
-        </w:rPr>
-        <w:t>and</w:t>
-      </w:r>
-      <w:r>
-        <w:rPr>
-          <w:spacing w:val="16"/>
-          <w:w w:val="105"/>
-          <w:sz w:val="20"/>
-        </w:rPr>
-        <w:t> </w:t>
-      </w:r>
-      <w:r>
-        <w:rPr>
-          <w:w w:val="105"/>
-          <w:sz w:val="20"/>
-        </w:rPr>
-        <w:t>served</w:t>
-      </w:r>
-      <w:r>
-        <w:rPr>
-          <w:spacing w:val="17"/>
-          <w:w w:val="105"/>
-          <w:sz w:val="20"/>
-        </w:rPr>
-        <w:t> </w:t>
-      </w:r>
-      <w:r>
-        <w:rPr>
-          <w:w w:val="105"/>
-          <w:sz w:val="20"/>
-        </w:rPr>
-        <w:t>predictions</w:t>
-      </w:r>
-      <w:r>
-        <w:rPr>
-          <w:spacing w:val="16"/>
-          <w:w w:val="105"/>
-          <w:sz w:val="20"/>
-        </w:rPr>
-        <w:t> </w:t>
-      </w:r>
-      <w:r>
-        <w:rPr>
-          <w:w w:val="105"/>
-          <w:sz w:val="20"/>
-        </w:rPr>
-        <w:t>via</w:t>
-      </w:r>
-      <w:r>
-        <w:rPr>
-          <w:spacing w:val="17"/>
-          <w:w w:val="105"/>
-          <w:sz w:val="20"/>
-        </w:rPr>
-        <w:t> </w:t>
-      </w:r>
-      <w:r>
-        <w:rPr>
-          <w:w w:val="105"/>
-          <w:sz w:val="20"/>
-        </w:rPr>
-        <w:t>Flask</w:t>
-      </w:r>
-      <w:r>
-        <w:rPr>
-          <w:spacing w:val="16"/>
-          <w:w w:val="105"/>
-          <w:sz w:val="20"/>
-        </w:rPr>
-        <w:t> </w:t>
-      </w:r>
-      <w:r>
-        <w:rPr>
-          <w:w w:val="105"/>
-          <w:sz w:val="20"/>
-        </w:rPr>
-        <w:t>with</w:t>
-      </w:r>
-      <w:r>
-        <w:rPr>
-          <w:spacing w:val="17"/>
-          <w:w w:val="105"/>
-          <w:sz w:val="20"/>
-        </w:rPr>
-        <w:t> </w:t>
-      </w:r>
-      <w:r>
-        <w:rPr>
-          <w:w w:val="105"/>
-          <w:sz w:val="20"/>
-        </w:rPr>
-        <w:t>MongoDB</w:t>
-      </w:r>
-      <w:r>
-        <w:rPr>
-          <w:spacing w:val="16"/>
-          <w:w w:val="105"/>
-          <w:sz w:val="20"/>
-        </w:rPr>
-        <w:t> </w:t>
-      </w:r>
-      <w:r>
-        <w:rPr>
-          <w:w w:val="105"/>
-          <w:sz w:val="20"/>
-        </w:rPr>
-        <w:t>Atlas,</w:t>
-      </w:r>
-      <w:r>
-        <w:rPr>
-          <w:spacing w:val="17"/>
-          <w:w w:val="105"/>
-          <w:sz w:val="20"/>
-        </w:rPr>
-        <w:t> </w:t>
-      </w:r>
-      <w:r>
-        <w:rPr>
-          <w:w w:val="105"/>
-          <w:sz w:val="20"/>
-        </w:rPr>
-        <w:t>reducing</w:t>
-      </w:r>
-      <w:r>
-        <w:rPr>
-          <w:spacing w:val="16"/>
-          <w:w w:val="105"/>
-          <w:sz w:val="20"/>
-        </w:rPr>
-        <w:t> </w:t>
-      </w:r>
-      <w:r>
-        <w:rPr>
-          <w:w w:val="105"/>
-          <w:sz w:val="20"/>
-        </w:rPr>
-        <w:t>diagnostic</w:t>
-      </w:r>
-      <w:r>
-        <w:rPr>
-          <w:spacing w:val="17"/>
-          <w:w w:val="105"/>
-          <w:sz w:val="20"/>
-        </w:rPr>
-        <w:t> </w:t>
-      </w:r>
-      <w:r>
-        <w:rPr>
-          <w:w w:val="105"/>
-          <w:sz w:val="20"/>
-        </w:rPr>
-        <w:t>reporting</w:t>
-      </w:r>
-      <w:r>
-        <w:rPr>
-          <w:spacing w:val="16"/>
-          <w:w w:val="105"/>
-          <w:sz w:val="20"/>
-        </w:rPr>
-        <w:t> </w:t>
-      </w:r>
-      <w:r>
-        <w:rPr>
-          <w:w w:val="105"/>
-          <w:sz w:val="20"/>
-        </w:rPr>
-        <w:t>time</w:t>
-      </w:r>
-      <w:r>
-        <w:rPr>
-          <w:spacing w:val="17"/>
-          <w:w w:val="105"/>
-          <w:sz w:val="20"/>
-        </w:rPr>
-        <w:t> </w:t>
-      </w:r>
-      <w:r>
-        <w:rPr>
-          <w:w w:val="105"/>
-          <w:sz w:val="20"/>
-        </w:rPr>
-        <w:t>by</w:t>
-      </w:r>
-      <w:r>
-        <w:rPr>
-          <w:spacing w:val="16"/>
-          <w:w w:val="105"/>
-          <w:sz w:val="20"/>
-        </w:rPr>
-        <w:t> </w:t>
-      </w:r>
-      <w:r>
-        <w:rPr>
-          <w:w w:val="105"/>
-          <w:sz w:val="20"/>
-        </w:rPr>
-        <w:t>30%</w:t>
-      </w:r>
-      <w:r>
-        <w:rPr>
-          <w:spacing w:val="16"/>
-          <w:w w:val="105"/>
-          <w:sz w:val="20"/>
-        </w:rPr>
-        <w:t> </w:t>
-      </w:r>
-      <w:r>
-        <w:rPr>
-          <w:spacing w:val="-2"/>
-          <w:w w:val="105"/>
-          <w:sz w:val="20"/>
-        </w:rPr>
-        <w:t>overall.</w:t>
-      </w:r>
+      <w:r/>
     </w:p>
     <w:sectPr>
       <w:type w:val="continuous"/>

</xml_diff>